<commit_message>
Raport czasu autonomii: dodano 6 wykresow porownawczych (autonomia wg konfiguracji, profil awarii, zaleznosc od paliwa i pojemnosci BESS, pokrycie energii)
</commit_message>
<xml_diff>
--- a/03_Symulacje_Homer/RAPORT_Czas_autonomii_szpitala.docx
+++ b/03_Symulacje_Homer/RAPORT_Czas_autonomii_szpitala.docx
@@ -900,6 +900,67 @@
           <w:szCs w:val="20"/>
         </w:rPr>
         <w:t xml:space="preserve">Tabela 1. Warunki brzegowe analizy czasu autonomii</w:t>
+      </w:r>
+    </w:p>
+    <w:p>
+      <w:pPr>
+        <w:spacing w:after="60" w:before="120"/>
+        <w:jc w:val="center"/>
+      </w:pPr>
+      <w:r>
+        <w:drawing>
+          <wp:inline distT="0" distB="0" distL="0" distR="0">
+            <wp:extent cx="4476750" cy="2238375"/>
+            <wp:effectExtent t="0" r="0" b="0" l="0"/>
+            <wp:docPr id="1" name="" descr="" title=""/>
+            <wp:cNvGraphicFramePr>
+              <a:graphicFrameLocks xmlns:a="http://schemas.openxmlformats.org/drawingml/2006/main" noChangeAspect="1"/>
+            </wp:cNvGraphicFramePr>
+            <a:graphic xmlns:a="http://schemas.openxmlformats.org/drawingml/2006/main">
+              <a:graphicData uri="http://schemas.openxmlformats.org/drawingml/2006/picture">
+                <pic:pic xmlns:pic="http://schemas.openxmlformats.org/drawingml/2006/picture">
+                  <pic:nvPicPr>
+                    <pic:cNvPr id="0" name="" descr=""/>
+                    <pic:cNvPicPr>
+                      <a:picLocks noChangeAspect="1" noChangeArrowheads="1"/>
+                    </pic:cNvPicPr>
+                  </pic:nvPicPr>
+                  <pic:blipFill>
+                    <a:blip r:embed="rId8" cstate="none"/>
+                    <a:srcRect/>
+                    <a:stretch>
+                      <a:fillRect/>
+                    </a:stretch>
+                  </pic:blipFill>
+                  <pic:spPr bwMode="auto">
+                    <a:xfrm>
+                      <a:off x="0" y="0"/>
+                      <a:ext cx="4476750" cy="2238375"/>
+                    </a:xfrm>
+                    <a:prstGeom prst="rect">
+                      <a:avLst/>
+                    </a:prstGeom>
+                  </pic:spPr>
+                </pic:pic>
+              </a:graphicData>
+            </a:graphic>
+          </wp:inline>
+        </w:drawing>
+      </w:r>
+    </w:p>
+    <w:p>
+      <w:pPr>
+        <w:spacing w:after="200" w:before="80" w:line="240"/>
+        <w:jc w:val="center"/>
+      </w:pPr>
+      <w:r>
+        <w:rPr>
+          <w:i/>
+          <w:iCs/>
+          <w:sz w:val="20"/>
+          <w:szCs w:val="20"/>
+        </w:rPr>
+        <w:t xml:space="preserve">Rysunek 1. Obciążenie szpitala podczas awarii 72 h a moce dostępnych źródeł</w:t>
       </w:r>
     </w:p>
     <w:p>
@@ -2381,6 +2442,67 @@
     </w:p>
     <w:p>
       <w:pPr>
+        <w:spacing w:after="60" w:before="120"/>
+        <w:jc w:val="center"/>
+      </w:pPr>
+      <w:r>
+        <w:drawing>
+          <wp:inline distT="0" distB="0" distL="0" distR="0">
+            <wp:extent cx="4191000" cy="2152650"/>
+            <wp:effectExtent t="0" r="0" b="0" l="0"/>
+            <wp:docPr id="1" name="" descr="" title=""/>
+            <wp:cNvGraphicFramePr>
+              <a:graphicFrameLocks xmlns:a="http://schemas.openxmlformats.org/drawingml/2006/main" noChangeAspect="1"/>
+            </wp:cNvGraphicFramePr>
+            <a:graphic xmlns:a="http://schemas.openxmlformats.org/drawingml/2006/main">
+              <a:graphicData uri="http://schemas.openxmlformats.org/drawingml/2006/picture">
+                <pic:pic xmlns:pic="http://schemas.openxmlformats.org/drawingml/2006/picture">
+                  <pic:nvPicPr>
+                    <pic:cNvPr id="0" name="" descr=""/>
+                    <pic:cNvPicPr>
+                      <a:picLocks noChangeAspect="1" noChangeArrowheads="1"/>
+                    </pic:cNvPicPr>
+                  </pic:nvPicPr>
+                  <pic:blipFill>
+                    <a:blip r:embed="rId9" cstate="none"/>
+                    <a:srcRect/>
+                    <a:stretch>
+                      <a:fillRect/>
+                    </a:stretch>
+                  </pic:blipFill>
+                  <pic:spPr bwMode="auto">
+                    <a:xfrm>
+                      <a:off x="0" y="0"/>
+                      <a:ext cx="4191000" cy="2152650"/>
+                    </a:xfrm>
+                    <a:prstGeom prst="rect">
+                      <a:avLst/>
+                    </a:prstGeom>
+                  </pic:spPr>
+                </pic:pic>
+              </a:graphicData>
+            </a:graphic>
+          </wp:inline>
+        </w:drawing>
+      </w:r>
+    </w:p>
+    <w:p>
+      <w:pPr>
+        <w:spacing w:after="200" w:before="80" w:line="240"/>
+        <w:jc w:val="center"/>
+      </w:pPr>
+      <w:r>
+        <w:rPr>
+          <w:i/>
+          <w:iCs/>
+          <w:sz w:val="20"/>
+          <w:szCs w:val="20"/>
+        </w:rPr>
+        <w:t xml:space="preserve">Rysunek 2. Konfiguracja K1 — zależność czasu autonomii od zapasu paliwa</w:t>
+      </w:r>
+    </w:p>
+    <w:p>
+      <w:pPr>
         <w:spacing w:after="120" w:before="0" w:line="360"/>
         <w:ind w:firstLine="566"/>
         <w:jc w:val="both"/>
@@ -4581,6 +4703,67 @@
     </w:p>
     <w:p>
       <w:pPr>
+        <w:spacing w:after="60" w:before="120"/>
+        <w:jc w:val="center"/>
+      </w:pPr>
+      <w:r>
+        <w:drawing>
+          <wp:inline distT="0" distB="0" distL="0" distR="0">
+            <wp:extent cx="4191000" cy="2152650"/>
+            <wp:effectExtent t="0" r="0" b="0" l="0"/>
+            <wp:docPr id="1" name="" descr="" title=""/>
+            <wp:cNvGraphicFramePr>
+              <a:graphicFrameLocks xmlns:a="http://schemas.openxmlformats.org/drawingml/2006/main" noChangeAspect="1"/>
+            </wp:cNvGraphicFramePr>
+            <a:graphic xmlns:a="http://schemas.openxmlformats.org/drawingml/2006/main">
+              <a:graphicData uri="http://schemas.openxmlformats.org/drawingml/2006/picture">
+                <pic:pic xmlns:pic="http://schemas.openxmlformats.org/drawingml/2006/picture">
+                  <pic:nvPicPr>
+                    <pic:cNvPr id="0" name="" descr=""/>
+                    <pic:cNvPicPr>
+                      <a:picLocks noChangeAspect="1" noChangeArrowheads="1"/>
+                    </pic:cNvPicPr>
+                  </pic:nvPicPr>
+                  <pic:blipFill>
+                    <a:blip r:embed="rId10" cstate="none"/>
+                    <a:srcRect/>
+                    <a:stretch>
+                      <a:fillRect/>
+                    </a:stretch>
+                  </pic:blipFill>
+                  <pic:spPr bwMode="auto">
+                    <a:xfrm>
+                      <a:off x="0" y="0"/>
+                      <a:ext cx="4191000" cy="2152650"/>
+                    </a:xfrm>
+                    <a:prstGeom prst="rect">
+                      <a:avLst/>
+                    </a:prstGeom>
+                  </pic:spPr>
+                </pic:pic>
+              </a:graphicData>
+            </a:graphic>
+          </wp:inline>
+        </w:drawing>
+      </w:r>
+    </w:p>
+    <w:p>
+      <w:pPr>
+        <w:spacing w:after="200" w:before="80" w:line="240"/>
+        <w:jc w:val="center"/>
+      </w:pPr>
+      <w:r>
+        <w:rPr>
+          <w:i/>
+          <w:iCs/>
+          <w:sz w:val="20"/>
+          <w:szCs w:val="20"/>
+        </w:rPr>
+        <w:t xml:space="preserve">Rysunek 3. Konfiguracja K2 — zależność czasu autonomii od pojemności magazynu</w:t>
+      </w:r>
+    </w:p>
+    <w:p>
+      <w:pPr>
         <w:spacing w:after="120" w:before="0" w:line="360"/>
         <w:ind w:firstLine="566"/>
         <w:jc w:val="both"/>
@@ -6359,6 +6542,67 @@
           <w:szCs w:val="20"/>
         </w:rPr>
         <w:t xml:space="preserve">Tabela 13. Zestawienie czasów autonomii konfiguracji K3</w:t>
+      </w:r>
+    </w:p>
+    <w:p>
+      <w:pPr>
+        <w:spacing w:after="60" w:before="120"/>
+        <w:jc w:val="center"/>
+      </w:pPr>
+      <w:r>
+        <w:drawing>
+          <wp:inline distT="0" distB="0" distL="0" distR="0">
+            <wp:extent cx="4095750" cy="1990725"/>
+            <wp:effectExtent t="0" r="0" b="0" l="0"/>
+            <wp:docPr id="1" name="" descr="" title=""/>
+            <wp:cNvGraphicFramePr>
+              <a:graphicFrameLocks xmlns:a="http://schemas.openxmlformats.org/drawingml/2006/main" noChangeAspect="1"/>
+            </wp:cNvGraphicFramePr>
+            <a:graphic xmlns:a="http://schemas.openxmlformats.org/drawingml/2006/main">
+              <a:graphicData uri="http://schemas.openxmlformats.org/drawingml/2006/picture">
+                <pic:pic xmlns:pic="http://schemas.openxmlformats.org/drawingml/2006/picture">
+                  <pic:nvPicPr>
+                    <pic:cNvPr id="0" name="" descr=""/>
+                    <pic:cNvPicPr>
+                      <a:picLocks noChangeAspect="1" noChangeArrowheads="1"/>
+                    </pic:cNvPicPr>
+                  </pic:nvPicPr>
+                  <pic:blipFill>
+                    <a:blip r:embed="rId11" cstate="none"/>
+                    <a:srcRect/>
+                    <a:stretch>
+                      <a:fillRect/>
+                    </a:stretch>
+                  </pic:blipFill>
+                  <pic:spPr bwMode="auto">
+                    <a:xfrm>
+                      <a:off x="0" y="0"/>
+                      <a:ext cx="4095750" cy="1990725"/>
+                    </a:xfrm>
+                    <a:prstGeom prst="rect">
+                      <a:avLst/>
+                    </a:prstGeom>
+                  </pic:spPr>
+                </pic:pic>
+              </a:graphicData>
+            </a:graphic>
+          </wp:inline>
+        </w:drawing>
+      </w:r>
+    </w:p>
+    <w:p>
+      <w:pPr>
+        <w:spacing w:after="200" w:before="80" w:line="240"/>
+        <w:jc w:val="center"/>
+      </w:pPr>
+      <w:r>
+        <w:rPr>
+          <w:i/>
+          <w:iCs/>
+          <w:sz w:val="20"/>
+          <w:szCs w:val="20"/>
+        </w:rPr>
+        <w:t xml:space="preserve">Rysunek 6. Wariant A2 — redukcja energii niedostarczonej dzięki kogeneracji</w:t>
       </w:r>
     </w:p>
     <w:p>
@@ -6974,6 +7218,128 @@
           <w:szCs w:val="20"/>
         </w:rPr>
         <w:t xml:space="preserve">Tabela 14. Porównanie czasów autonomii dla trzech konfiguracji</w:t>
+      </w:r>
+    </w:p>
+    <w:p>
+      <w:pPr>
+        <w:spacing w:after="60" w:before="120"/>
+        <w:jc w:val="center"/>
+      </w:pPr>
+      <w:r>
+        <w:drawing>
+          <wp:inline distT="0" distB="0" distL="0" distR="0">
+            <wp:extent cx="4381500" cy="2438400"/>
+            <wp:effectExtent t="0" r="0" b="0" l="0"/>
+            <wp:docPr id="1" name="" descr="" title=""/>
+            <wp:cNvGraphicFramePr>
+              <a:graphicFrameLocks xmlns:a="http://schemas.openxmlformats.org/drawingml/2006/main" noChangeAspect="1"/>
+            </wp:cNvGraphicFramePr>
+            <a:graphic xmlns:a="http://schemas.openxmlformats.org/drawingml/2006/main">
+              <a:graphicData uri="http://schemas.openxmlformats.org/drawingml/2006/picture">
+                <pic:pic xmlns:pic="http://schemas.openxmlformats.org/drawingml/2006/picture">
+                  <pic:nvPicPr>
+                    <pic:cNvPr id="0" name="" descr=""/>
+                    <pic:cNvPicPr>
+                      <a:picLocks noChangeAspect="1" noChangeArrowheads="1"/>
+                    </pic:cNvPicPr>
+                  </pic:nvPicPr>
+                  <pic:blipFill>
+                    <a:blip r:embed="rId12" cstate="none"/>
+                    <a:srcRect/>
+                    <a:stretch>
+                      <a:fillRect/>
+                    </a:stretch>
+                  </pic:blipFill>
+                  <pic:spPr bwMode="auto">
+                    <a:xfrm>
+                      <a:off x="0" y="0"/>
+                      <a:ext cx="4381500" cy="2438400"/>
+                    </a:xfrm>
+                    <a:prstGeom prst="rect">
+                      <a:avLst/>
+                    </a:prstGeom>
+                  </pic:spPr>
+                </pic:pic>
+              </a:graphicData>
+            </a:graphic>
+          </wp:inline>
+        </w:drawing>
+      </w:r>
+    </w:p>
+    <w:p>
+      <w:pPr>
+        <w:spacing w:after="200" w:before="80" w:line="240"/>
+        <w:jc w:val="center"/>
+      </w:pPr>
+      <w:r>
+        <w:rPr>
+          <w:i/>
+          <w:iCs/>
+          <w:sz w:val="20"/>
+          <w:szCs w:val="20"/>
+        </w:rPr>
+        <w:t xml:space="preserve">Rysunek 4. Porównanie czasów autonomii — zestawienie zbiorcze</w:t>
+      </w:r>
+    </w:p>
+    <w:p>
+      <w:pPr>
+        <w:spacing w:after="60" w:before="120"/>
+        <w:jc w:val="center"/>
+      </w:pPr>
+      <w:r>
+        <w:drawing>
+          <wp:inline distT="0" distB="0" distL="0" distR="0">
+            <wp:extent cx="4333875" cy="2286000"/>
+            <wp:effectExtent t="0" r="0" b="0" l="0"/>
+            <wp:docPr id="1" name="" descr="" title=""/>
+            <wp:cNvGraphicFramePr>
+              <a:graphicFrameLocks xmlns:a="http://schemas.openxmlformats.org/drawingml/2006/main" noChangeAspect="1"/>
+            </wp:cNvGraphicFramePr>
+            <a:graphic xmlns:a="http://schemas.openxmlformats.org/drawingml/2006/main">
+              <a:graphicData uri="http://schemas.openxmlformats.org/drawingml/2006/picture">
+                <pic:pic xmlns:pic="http://schemas.openxmlformats.org/drawingml/2006/picture">
+                  <pic:nvPicPr>
+                    <pic:cNvPr id="0" name="" descr=""/>
+                    <pic:cNvPicPr>
+                      <a:picLocks noChangeAspect="1" noChangeArrowheads="1"/>
+                    </pic:cNvPicPr>
+                  </pic:nvPicPr>
+                  <pic:blipFill>
+                    <a:blip r:embed="rId13" cstate="none"/>
+                    <a:srcRect/>
+                    <a:stretch>
+                      <a:fillRect/>
+                    </a:stretch>
+                  </pic:blipFill>
+                  <pic:spPr bwMode="auto">
+                    <a:xfrm>
+                      <a:off x="0" y="0"/>
+                      <a:ext cx="4333875" cy="2286000"/>
+                    </a:xfrm>
+                    <a:prstGeom prst="rect">
+                      <a:avLst/>
+                    </a:prstGeom>
+                  </pic:spPr>
+                </pic:pic>
+              </a:graphicData>
+            </a:graphic>
+          </wp:inline>
+        </w:drawing>
+      </w:r>
+    </w:p>
+    <w:p>
+      <w:pPr>
+        <w:spacing w:after="200" w:before="80" w:line="240"/>
+        <w:jc w:val="center"/>
+      </w:pPr>
+      <w:r>
+        <w:rPr>
+          <w:i/>
+          <w:iCs/>
+          <w:sz w:val="20"/>
+          <w:szCs w:val="20"/>
+        </w:rPr>
+        <w:t xml:space="preserve">Rysunek 5. Pokrycie zapotrzebowania energetycznego podczas awarii 72 h</w:t>
       </w:r>
     </w:p>
     <w:p>

</xml_diff>